<commit_message>
AI 7 7/7 not done yet
</commit_message>
<xml_diff>
--- a/8 семестр/МиСИИ/ЛР 7/МиСИИ ЛР 7.docx
+++ b/8 семестр/МиСИИ/ЛР 7/МиСИИ ЛР 7.docx
@@ -878,6 +878,77 @@
       <w:r>
         <w:t>:</w:t>
       </w:r>
+      <w:r>
+        <w:t xml:space="preserve"> </w:t>
+      </w:r>
+      <w:r>
+        <w:t>в</w:t>
+      </w:r>
+      <w:r>
+        <w:t xml:space="preserve"> файле </w:t>
+      </w:r>
+      <w:r>
+        <w:rPr>
+          <w:lang w:val="en-US"/>
+        </w:rPr>
+        <w:t>model</w:t>
+      </w:r>
+      <w:r>
+        <w:t>.</w:t>
+      </w:r>
+      <w:r>
+        <w:rPr>
+          <w:lang w:val="en-US"/>
+        </w:rPr>
+        <w:t>py</w:t>
+      </w:r>
+      <w:r>
+        <w:t xml:space="preserve"> реализовать класс </w:t>
+      </w:r>
+      <w:proofErr w:type="spellStart"/>
+      <w:r>
+        <w:rPr>
+          <w:rFonts w:ascii="Courier New" w:hAnsi="Courier New" w:cs="Courier New"/>
+          <w:sz w:val="24"/>
+          <w:szCs w:val="20"/>
+          <w:lang w:val="en-US"/>
+        </w:rPr>
+        <w:t>DeepQNetwork</w:t>
+      </w:r>
+      <w:proofErr w:type="spellEnd"/>
+      <w:r>
+        <w:t xml:space="preserve">, который представляет собой глубокую нейронную сеть, предсказывающую </w:t>
+      </w:r>
+      <w:r>
+        <w:rPr>
+          <w:lang w:val="en-US"/>
+        </w:rPr>
+        <w:t>Q</w:t>
+      </w:r>
+      <w:r>
+        <w:t>-ценности для всех возможных пар (</w:t>
+      </w:r>
+      <w:r>
+        <w:rPr>
+          <w:lang w:val="en-US"/>
+        </w:rPr>
+        <w:t>s</w:t>
+      </w:r>
+      <w:r>
+        <w:t xml:space="preserve">, </w:t>
+      </w:r>
+      <w:r>
+        <w:rPr>
+          <w:lang w:val="en-US"/>
+        </w:rPr>
+        <w:t>a</w:t>
+      </w:r>
+      <w:r>
+        <w:t>)</w:t>
+      </w:r>
+      <w:r>
+        <w:t>.</w:t>
+      </w:r>
     </w:p>
     <w:p/>
     <w:p/>
@@ -944,8 +1015,8 @@
           <w:noProof/>
         </w:rPr>
         <w:drawing>
-          <wp:inline distT="0" distB="0" distL="0" distR="0" wp14:anchorId="21B79C2A" wp14:editId="33969CF1">
-            <wp:extent cx="2387600" cy="1787631"/>
+          <wp:inline distT="0" distB="0" distL="0" distR="0" wp14:anchorId="21B79C2A" wp14:editId="68A17B8E">
+            <wp:extent cx="2387459" cy="1787525"/>
             <wp:effectExtent l="0" t="0" r="0" b="0"/>
             <wp:docPr id="1440690013" name="Рисунок 1"/>
             <wp:cNvGraphicFramePr>
@@ -967,7 +1038,7 @@
                   <pic:spPr>
                     <a:xfrm>
                       <a:off x="0" y="0"/>
-                      <a:ext cx="2398772" cy="1795995"/>
+                      <a:ext cx="2400632" cy="1797388"/>
                     </a:xfrm>
                     <a:prstGeom prst="rect">
                       <a:avLst/>
@@ -1017,6 +1088,7 @@
         </w:numPr>
       </w:pPr>
       <w:r>
+        <w:lastRenderedPageBreak/>
         <w:t>Итерации по значениям</w:t>
       </w:r>
     </w:p>
@@ -1039,7 +1111,6 @@
           <w:bCs/>
           <w:szCs w:val="28"/>
         </w:rPr>
-        <w:lastRenderedPageBreak/>
         <w:t>Б</w:t>
       </w:r>
       <w:r>
@@ -2222,6 +2293,7 @@
         <w:rPr>
           <w:lang w:val="en-US"/>
         </w:rPr>
+        <w:lastRenderedPageBreak/>
         <w:t xml:space="preserve">            </w:t>
       </w:r>
     </w:p>
@@ -2359,7 +2431,6 @@
         <w:rPr>
           <w:lang w:val="en-US"/>
         </w:rPr>
-        <w:lastRenderedPageBreak/>
         <w:t xml:space="preserve">    def </w:t>
       </w:r>
       <w:proofErr w:type="spellStart"/>
@@ -3522,8 +3593,8 @@
         </w:rPr>
         <w:lastRenderedPageBreak/>
         <w:drawing>
-          <wp:inline distT="0" distB="0" distL="0" distR="0" wp14:anchorId="1C6A1D82" wp14:editId="49FABD80">
-            <wp:extent cx="5041612" cy="2569845"/>
+          <wp:inline distT="0" distB="0" distL="0" distR="0" wp14:anchorId="1C6A1D82" wp14:editId="77FEB0DB">
+            <wp:extent cx="5443994" cy="2774950"/>
             <wp:effectExtent l="0" t="0" r="0" b="0"/>
             <wp:docPr id="769415298" name="Рисунок 1"/>
             <wp:cNvGraphicFramePr>
@@ -3545,7 +3616,7 @@
                   <pic:spPr>
                     <a:xfrm>
                       <a:off x="0" y="0"/>
-                      <a:ext cx="5043205" cy="2570657"/>
+                      <a:ext cx="5469882" cy="2788146"/>
                     </a:xfrm>
                     <a:prstGeom prst="rect">
                       <a:avLst/>
@@ -3768,6 +3839,7 @@
     <w:p/>
     <w:p>
       <w:r>
+        <w:lastRenderedPageBreak/>
         <w:t xml:space="preserve">Листинг 3.2 – </w:t>
       </w:r>
       <w:r>
@@ -3780,7 +3852,6 @@
       </w:pPr>
       <w:proofErr w:type="spellStart"/>
       <w:r>
-        <w:lastRenderedPageBreak/>
         <w:t>def</w:t>
       </w:r>
       <w:proofErr w:type="spellEnd"/>
@@ -8616,7 +8687,6 @@
     </w:p>
     <w:p>
       <w:pPr>
-        <w:ind w:firstLine="0"/>
         <w:rPr>
           <w:lang w:val="en-US"/>
         </w:rPr>
@@ -8993,7 +9063,10 @@
         <w:t xml:space="preserve">, </w:t>
       </w:r>
       <w:r>
-        <w:sym w:font="Symbol" w:char="F061"/>
+        <w:rPr>
+          <w:lang w:val="en-US"/>
+        </w:rPr>
+        <w:t>a</w:t>
       </w:r>
       <w:r>
         <w:t xml:space="preserve">), </w:t>
@@ -11055,8 +11128,8 @@
           <w:noProof/>
         </w:rPr>
         <w:drawing>
-          <wp:inline distT="0" distB="0" distL="0" distR="0" wp14:anchorId="3AC70B15" wp14:editId="1CAE0078">
-            <wp:extent cx="6299835" cy="1805305"/>
+          <wp:inline distT="0" distB="0" distL="0" distR="0" wp14:anchorId="3AC70B15" wp14:editId="346F78DD">
+            <wp:extent cx="6102350" cy="1748713"/>
             <wp:effectExtent l="0" t="0" r="0" b="0"/>
             <wp:docPr id="1162968062" name="Рисунок 1"/>
             <wp:cNvGraphicFramePr>
@@ -11078,7 +11151,7 @@
                   <pic:spPr>
                     <a:xfrm>
                       <a:off x="0" y="0"/>
-                      <a:ext cx="6299835" cy="1805305"/>
+                      <a:ext cx="6109593" cy="1750789"/>
                     </a:xfrm>
                     <a:prstGeom prst="rect">
                       <a:avLst/>
@@ -11134,8 +11207,8 @@
           <w:noProof/>
         </w:rPr>
         <w:drawing>
-          <wp:inline distT="0" distB="0" distL="0" distR="0" wp14:anchorId="307B2E42" wp14:editId="75233FA0">
-            <wp:extent cx="5041900" cy="2723470"/>
+          <wp:inline distT="0" distB="0" distL="0" distR="0" wp14:anchorId="307B2E42" wp14:editId="7C517A00">
+            <wp:extent cx="4889500" cy="2641149"/>
             <wp:effectExtent l="0" t="0" r="0" b="0"/>
             <wp:docPr id="913177739" name="Рисунок 1"/>
             <wp:cNvGraphicFramePr>
@@ -11157,7 +11230,7 @@
                   <pic:spPr>
                     <a:xfrm>
                       <a:off x="0" y="0"/>
-                      <a:ext cx="5047003" cy="2726227"/>
+                      <a:ext cx="4903456" cy="2648688"/>
                     </a:xfrm>
                     <a:prstGeom prst="rect">
                       <a:avLst/>
@@ -11215,24 +11288,2139 @@
     </w:p>
     <w:p/>
     <w:p>
+      <w:pPr>
+        <w:rPr>
+          <w:lang w:val="en-US"/>
+        </w:rPr>
+      </w:pPr>
+      <w:r>
+        <w:t>В</w:t>
+      </w:r>
+      <w:r>
+        <w:t xml:space="preserve"> файле model.py </w:t>
+      </w:r>
+      <w:r>
+        <w:t xml:space="preserve">был </w:t>
+      </w:r>
+      <w:r>
+        <w:t>дописан</w:t>
+      </w:r>
+      <w:r>
+        <w:t xml:space="preserve"> класс </w:t>
+      </w:r>
+      <w:proofErr w:type="spellStart"/>
+      <w:r>
+        <w:rPr>
+          <w:rFonts w:ascii="Courier New" w:hAnsi="Courier New" w:cs="Courier New"/>
+          <w:sz w:val="24"/>
+          <w:szCs w:val="20"/>
+        </w:rPr>
+        <w:t>DeepQNetwork</w:t>
+      </w:r>
+      <w:proofErr w:type="spellEnd"/>
+      <w:r>
+        <w:rPr>
+          <w:sz w:val="24"/>
+          <w:szCs w:val="20"/>
+        </w:rPr>
+        <w:t xml:space="preserve"> </w:t>
+      </w:r>
+      <w:r>
+        <w:t xml:space="preserve">(листинг 3.7). </w:t>
+      </w:r>
+      <w:r>
+        <w:t>В нём реализована</w:t>
+      </w:r>
+      <w:r>
+        <w:t xml:space="preserve"> </w:t>
+      </w:r>
+      <w:r>
+        <w:t>глубокая</w:t>
+      </w:r>
+      <w:r>
+        <w:t xml:space="preserve"> нейронн</w:t>
+      </w:r>
+      <w:r>
+        <w:t>ая</w:t>
+      </w:r>
+      <w:r>
+        <w:t xml:space="preserve"> сеть, предсказывающ</w:t>
+      </w:r>
+      <w:r>
+        <w:t>ая</w:t>
+      </w:r>
+      <w:r>
+        <w:t xml:space="preserve"> Q-ценности для всех возможных пар (</w:t>
+      </w:r>
+      <w:r>
+        <w:t>s, a</w:t>
+      </w:r>
+      <w:r>
+        <w:t>).</w:t>
+      </w:r>
+    </w:p>
+    <w:p>
+      <w:r>
+        <w:t>Был определён к</w:t>
+      </w:r>
+      <w:r>
+        <w:t xml:space="preserve">онструктор нейросети </w:t>
+      </w:r>
+      <w:r>
+        <w:rPr>
+          <w:rFonts w:ascii="Courier New" w:hAnsi="Courier New" w:cs="Courier New"/>
+          <w:sz w:val="24"/>
+          <w:szCs w:val="20"/>
+        </w:rPr>
+        <w:t>__</w:t>
+      </w:r>
+      <w:proofErr w:type="spellStart"/>
+      <w:r>
+        <w:rPr>
+          <w:rFonts w:ascii="Courier New" w:hAnsi="Courier New" w:cs="Courier New"/>
+          <w:sz w:val="24"/>
+          <w:szCs w:val="20"/>
+        </w:rPr>
+        <w:t>init</w:t>
+      </w:r>
+      <w:proofErr w:type="spellEnd"/>
+      <w:r>
+        <w:rPr>
+          <w:rFonts w:ascii="Courier New" w:hAnsi="Courier New" w:cs="Courier New"/>
+          <w:sz w:val="24"/>
+          <w:szCs w:val="20"/>
+        </w:rPr>
+        <w:t>__</w:t>
+      </w:r>
+      <w:r>
+        <w:t xml:space="preserve">, </w:t>
+      </w:r>
+      <w:r>
+        <w:t xml:space="preserve">в нём инициализированы обязательные </w:t>
+      </w:r>
+      <w:r>
+        <w:t>гипер</w:t>
+      </w:r>
+      <w:r>
+        <w:t>параметр</w:t>
+      </w:r>
+      <w:r>
+        <w:t>ы</w:t>
+      </w:r>
+      <w:r>
+        <w:t>: скорость обучения, число обучающих игр, размер мини блока данных.</w:t>
+      </w:r>
+    </w:p>
+    <w:p>
+      <w:r>
+        <w:t xml:space="preserve">Для нейросети была выбрана трёхслойная архитектура, на выходах первого и второго слоя работает активационная функция </w:t>
+      </w:r>
+      <w:proofErr w:type="spellStart"/>
+      <w:r>
+        <w:rPr>
+          <w:lang w:val="en-US"/>
+        </w:rPr>
+        <w:t>ReLU</w:t>
+      </w:r>
+      <w:proofErr w:type="spellEnd"/>
       <w:r>
         <w:t>.</w:t>
       </w:r>
     </w:p>
-    <w:p>
-      <w:pPr>
-        <w:rPr>
-          <w:lang w:val="en-US"/>
-        </w:rPr>
-      </w:pPr>
-    </w:p>
-    <w:p>
-      <w:pPr>
-        <w:rPr>
-          <w:lang w:val="en-US"/>
-        </w:rPr>
-      </w:pPr>
-    </w:p>
+    <w:p/>
+    <w:p>
+      <w:r>
+        <w:t xml:space="preserve">Листинг 3.7 – Нейросеть с глубоким </w:t>
+      </w:r>
+      <w:r>
+        <w:rPr>
+          <w:lang w:val="en-US"/>
+        </w:rPr>
+        <w:t>Q</w:t>
+      </w:r>
+      <w:r>
+        <w:t>-</w:t>
+      </w:r>
+      <w:r>
+        <w:t>обучением</w:t>
+      </w:r>
+    </w:p>
+    <w:p>
+      <w:pPr>
+        <w:pStyle w:val="af"/>
+      </w:pPr>
+      <w:proofErr w:type="spellStart"/>
+      <w:r>
+        <w:t>class</w:t>
+      </w:r>
+      <w:proofErr w:type="spellEnd"/>
+      <w:r>
+        <w:t xml:space="preserve"> </w:t>
+      </w:r>
+      <w:proofErr w:type="spellStart"/>
+      <w:proofErr w:type="gramStart"/>
+      <w:r>
+        <w:rPr>
+          <w:b/>
+          <w:bCs/>
+        </w:rPr>
+        <w:t>DeepQNetwork</w:t>
+      </w:r>
+      <w:proofErr w:type="spellEnd"/>
+      <w:r>
+        <w:t>(</w:t>
+      </w:r>
+      <w:proofErr w:type="spellStart"/>
+      <w:proofErr w:type="gramEnd"/>
+      <w:r>
+        <w:t>Module</w:t>
+      </w:r>
+      <w:proofErr w:type="spellEnd"/>
+      <w:r>
+        <w:t>):</w:t>
+      </w:r>
+    </w:p>
+    <w:p>
+      <w:pPr>
+        <w:pStyle w:val="af"/>
+      </w:pPr>
+      <w:r>
+        <w:t>    """</w:t>
+      </w:r>
+    </w:p>
+    <w:p>
+      <w:pPr>
+        <w:pStyle w:val="af"/>
+      </w:pPr>
+      <w:r>
+        <w:t>    Модель глубокой нейросети для</w:t>
+      </w:r>
+    </w:p>
+    <w:p>
+      <w:pPr>
+        <w:pStyle w:val="af"/>
+      </w:pPr>
+      <w:r>
+        <w:t>    аппроксимации функции ценности Q(</w:t>
+      </w:r>
+      <w:proofErr w:type="spellStart"/>
+      <w:proofErr w:type="gramStart"/>
+      <w:r>
+        <w:t>s,a</w:t>
+      </w:r>
+      <w:proofErr w:type="spellEnd"/>
+      <w:r>
+        <w:t>) .</w:t>
+      </w:r>
+      <w:proofErr w:type="gramEnd"/>
+    </w:p>
+    <w:p>
+      <w:pPr>
+        <w:pStyle w:val="af"/>
+      </w:pPr>
+      <w:r>
+        <w:t xml:space="preserve">    </w:t>
+      </w:r>
+    </w:p>
+    <w:p>
+      <w:pPr>
+        <w:pStyle w:val="af"/>
+      </w:pPr>
+      <w:r>
+        <w:t xml:space="preserve">    </w:t>
+      </w:r>
+      <w:proofErr w:type="spellStart"/>
+      <w:r>
+        <w:t>state_dim</w:t>
+      </w:r>
+      <w:proofErr w:type="spellEnd"/>
+      <w:r>
+        <w:t xml:space="preserve"> - размер входного вектора состояний</w:t>
+      </w:r>
+    </w:p>
+    <w:p>
+      <w:pPr>
+        <w:pStyle w:val="af"/>
+      </w:pPr>
+      <w:r>
+        <w:t xml:space="preserve">    </w:t>
+      </w:r>
+      <w:proofErr w:type="spellStart"/>
+      <w:r>
+        <w:t>action_dim</w:t>
+      </w:r>
+      <w:proofErr w:type="spellEnd"/>
+      <w:r>
+        <w:t xml:space="preserve"> - кол-во действий</w:t>
+      </w:r>
+    </w:p>
+    <w:p>
+      <w:pPr>
+        <w:pStyle w:val="af"/>
+      </w:pPr>
+      <w:r>
+        <w:t xml:space="preserve">    </w:t>
+      </w:r>
+      <w:proofErr w:type="spellStart"/>
+      <w:proofErr w:type="gramStart"/>
+      <w:r>
+        <w:t>self.learning</w:t>
+      </w:r>
+      <w:proofErr w:type="gramEnd"/>
+      <w:r>
+        <w:t>_rate</w:t>
+      </w:r>
+      <w:proofErr w:type="spellEnd"/>
+      <w:r>
+        <w:t xml:space="preserve"> - скорость обучения нейросети</w:t>
+      </w:r>
+    </w:p>
+    <w:p>
+      <w:pPr>
+        <w:pStyle w:val="af"/>
+      </w:pPr>
+      <w:r>
+        <w:t xml:space="preserve">    </w:t>
+      </w:r>
+      <w:proofErr w:type="spellStart"/>
+      <w:proofErr w:type="gramStart"/>
+      <w:r>
+        <w:t>self.numTrainingGames</w:t>
+      </w:r>
+      <w:proofErr w:type="spellEnd"/>
+      <w:proofErr w:type="gramEnd"/>
+      <w:r>
+        <w:t xml:space="preserve"> - кол-во обучающих игр</w:t>
+      </w:r>
+    </w:p>
+    <w:p>
+      <w:pPr>
+        <w:pStyle w:val="af"/>
+      </w:pPr>
+      <w:r>
+        <w:t xml:space="preserve">    </w:t>
+      </w:r>
+      <w:proofErr w:type="spellStart"/>
+      <w:proofErr w:type="gramStart"/>
+      <w:r>
+        <w:t>self.batch</w:t>
+      </w:r>
+      <w:proofErr w:type="gramEnd"/>
+      <w:r>
+        <w:t>_size</w:t>
+      </w:r>
+      <w:proofErr w:type="spellEnd"/>
+      <w:r>
+        <w:t xml:space="preserve"> - размер </w:t>
+      </w:r>
+      <w:proofErr w:type="spellStart"/>
+      <w:r>
+        <w:t>миниблока</w:t>
+      </w:r>
+      <w:proofErr w:type="spellEnd"/>
+    </w:p>
+    <w:p>
+      <w:pPr>
+        <w:pStyle w:val="af"/>
+      </w:pPr>
+      <w:r>
+        <w:t>    """</w:t>
+      </w:r>
+    </w:p>
+    <w:p>
+      <w:pPr>
+        <w:pStyle w:val="af"/>
+      </w:pPr>
+      <w:r>
+        <w:t xml:space="preserve">    </w:t>
+      </w:r>
+    </w:p>
+    <w:p>
+      <w:pPr>
+        <w:pStyle w:val="af"/>
+        <w:rPr>
+          <w:lang w:val="en-US"/>
+        </w:rPr>
+      </w:pPr>
+      <w:r>
+        <w:t xml:space="preserve">    </w:t>
+      </w:r>
+      <w:r>
+        <w:rPr>
+          <w:lang w:val="en-US"/>
+        </w:rPr>
+        <w:t xml:space="preserve">def </w:t>
+      </w:r>
+      <w:r>
+        <w:rPr>
+          <w:b/>
+          <w:bCs/>
+          <w:lang w:val="en-US"/>
+        </w:rPr>
+        <w:t>__</w:t>
+      </w:r>
+      <w:proofErr w:type="spellStart"/>
+      <w:r>
+        <w:rPr>
+          <w:b/>
+          <w:bCs/>
+          <w:lang w:val="en-US"/>
+        </w:rPr>
+        <w:t>init</w:t>
+      </w:r>
+      <w:proofErr w:type="spellEnd"/>
+      <w:r>
+        <w:rPr>
+          <w:b/>
+          <w:bCs/>
+          <w:lang w:val="en-US"/>
+        </w:rPr>
+        <w:t>_</w:t>
+      </w:r>
+      <w:proofErr w:type="gramStart"/>
+      <w:r>
+        <w:rPr>
+          <w:b/>
+          <w:bCs/>
+          <w:lang w:val="en-US"/>
+        </w:rPr>
+        <w:t>_</w:t>
+      </w:r>
+      <w:r>
+        <w:rPr>
+          <w:lang w:val="en-US"/>
+        </w:rPr>
+        <w:t>(</w:t>
+      </w:r>
+      <w:proofErr w:type="gramEnd"/>
+      <w:r>
+        <w:rPr>
+          <w:lang w:val="en-US"/>
+        </w:rPr>
+        <w:t xml:space="preserve">self, </w:t>
+      </w:r>
+      <w:proofErr w:type="spellStart"/>
+      <w:r>
+        <w:rPr>
+          <w:lang w:val="en-US"/>
+        </w:rPr>
+        <w:t>state_dim</w:t>
+      </w:r>
+      <w:proofErr w:type="spellEnd"/>
+      <w:r>
+        <w:rPr>
+          <w:lang w:val="en-US"/>
+        </w:rPr>
+        <w:t xml:space="preserve">, </w:t>
+      </w:r>
+      <w:proofErr w:type="spellStart"/>
+      <w:r>
+        <w:rPr>
+          <w:lang w:val="en-US"/>
+        </w:rPr>
+        <w:t>action_dim</w:t>
+      </w:r>
+      <w:proofErr w:type="spellEnd"/>
+      <w:r>
+        <w:rPr>
+          <w:lang w:val="en-US"/>
+        </w:rPr>
+        <w:t>):</w:t>
+      </w:r>
+    </w:p>
+    <w:p>
+      <w:pPr>
+        <w:pStyle w:val="af"/>
+        <w:rPr>
+          <w:lang w:val="en-US"/>
+        </w:rPr>
+      </w:pPr>
+      <w:r>
+        <w:rPr>
+          <w:lang w:val="en-US"/>
+        </w:rPr>
+        <w:t xml:space="preserve">        </w:t>
+      </w:r>
+      <w:proofErr w:type="spellStart"/>
+      <w:r>
+        <w:rPr>
+          <w:lang w:val="en-US"/>
+        </w:rPr>
+        <w:t>self.num_actions</w:t>
+      </w:r>
+      <w:proofErr w:type="spellEnd"/>
+      <w:r>
+        <w:rPr>
+          <w:lang w:val="en-US"/>
+        </w:rPr>
+        <w:t xml:space="preserve"> = </w:t>
+      </w:r>
+      <w:proofErr w:type="spellStart"/>
+      <w:r>
+        <w:rPr>
+          <w:lang w:val="en-US"/>
+        </w:rPr>
+        <w:t>action_dim</w:t>
+      </w:r>
+      <w:proofErr w:type="spellEnd"/>
+      <w:r>
+        <w:rPr>
+          <w:lang w:val="en-US"/>
+        </w:rPr>
+        <w:t xml:space="preserve"> </w:t>
+      </w:r>
+    </w:p>
+    <w:p>
+      <w:pPr>
+        <w:pStyle w:val="af"/>
+        <w:rPr>
+          <w:lang w:val="en-US"/>
+        </w:rPr>
+      </w:pPr>
+      <w:r>
+        <w:rPr>
+          <w:lang w:val="en-US"/>
+        </w:rPr>
+        <w:t xml:space="preserve">        </w:t>
+      </w:r>
+      <w:proofErr w:type="spellStart"/>
+      <w:proofErr w:type="gramStart"/>
+      <w:r>
+        <w:rPr>
+          <w:lang w:val="en-US"/>
+        </w:rPr>
+        <w:t>self.state</w:t>
+      </w:r>
+      <w:proofErr w:type="gramEnd"/>
+      <w:r>
+        <w:rPr>
+          <w:lang w:val="en-US"/>
+        </w:rPr>
+        <w:t>_size</w:t>
+      </w:r>
+      <w:proofErr w:type="spellEnd"/>
+      <w:r>
+        <w:rPr>
+          <w:lang w:val="en-US"/>
+        </w:rPr>
+        <w:t xml:space="preserve"> = </w:t>
+      </w:r>
+      <w:proofErr w:type="spellStart"/>
+      <w:r>
+        <w:rPr>
+          <w:lang w:val="en-US"/>
+        </w:rPr>
+        <w:t>state_dim</w:t>
+      </w:r>
+      <w:proofErr w:type="spellEnd"/>
+      <w:r>
+        <w:rPr>
+          <w:lang w:val="en-US"/>
+        </w:rPr>
+        <w:t xml:space="preserve"> </w:t>
+      </w:r>
+    </w:p>
+    <w:p>
+      <w:pPr>
+        <w:pStyle w:val="af"/>
+        <w:rPr>
+          <w:lang w:val="en-US"/>
+        </w:rPr>
+      </w:pPr>
+      <w:r>
+        <w:rPr>
+          <w:lang w:val="en-US"/>
+        </w:rPr>
+        <w:t xml:space="preserve">        </w:t>
+      </w:r>
+      <w:proofErr w:type="gramStart"/>
+      <w:r>
+        <w:rPr>
+          <w:lang w:val="en-US"/>
+        </w:rPr>
+        <w:t>super(</w:t>
+      </w:r>
+      <w:proofErr w:type="spellStart"/>
+      <w:proofErr w:type="gramEnd"/>
+      <w:r>
+        <w:rPr>
+          <w:lang w:val="en-US"/>
+        </w:rPr>
+        <w:t>DeepQNetwork</w:t>
+      </w:r>
+      <w:proofErr w:type="spellEnd"/>
+      <w:r>
+        <w:rPr>
+          <w:lang w:val="en-US"/>
+        </w:rPr>
+        <w:t>, self</w:t>
+      </w:r>
+      <w:proofErr w:type="gramStart"/>
+      <w:r>
+        <w:rPr>
+          <w:lang w:val="en-US"/>
+        </w:rPr>
+        <w:t>)._</w:t>
+      </w:r>
+      <w:proofErr w:type="gramEnd"/>
+      <w:r>
+        <w:rPr>
+          <w:lang w:val="en-US"/>
+        </w:rPr>
+        <w:t>_</w:t>
+      </w:r>
+      <w:proofErr w:type="spellStart"/>
+      <w:r>
+        <w:rPr>
+          <w:lang w:val="en-US"/>
+        </w:rPr>
+        <w:t>init</w:t>
+      </w:r>
+      <w:proofErr w:type="spellEnd"/>
+      <w:r>
+        <w:rPr>
+          <w:lang w:val="en-US"/>
+        </w:rPr>
+        <w:t>_</w:t>
+      </w:r>
+      <w:proofErr w:type="gramStart"/>
+      <w:r>
+        <w:rPr>
+          <w:lang w:val="en-US"/>
+        </w:rPr>
+        <w:t>_(</w:t>
+      </w:r>
+      <w:proofErr w:type="gramEnd"/>
+      <w:r>
+        <w:rPr>
+          <w:lang w:val="en-US"/>
+        </w:rPr>
+        <w:t>)</w:t>
+      </w:r>
+    </w:p>
+    <w:p>
+      <w:pPr>
+        <w:pStyle w:val="af"/>
+        <w:rPr>
+          <w:lang w:val="en-US"/>
+        </w:rPr>
+      </w:pPr>
+      <w:r>
+        <w:rPr>
+          <w:lang w:val="en-US"/>
+        </w:rPr>
+        <w:t xml:space="preserve">        </w:t>
+      </w:r>
+    </w:p>
+    <w:p>
+      <w:pPr>
+        <w:pStyle w:val="af"/>
+        <w:rPr>
+          <w:lang w:val="en-US"/>
+        </w:rPr>
+      </w:pPr>
+      <w:r>
+        <w:rPr>
+          <w:lang w:val="en-US"/>
+        </w:rPr>
+        <w:t xml:space="preserve">        # </w:t>
+      </w:r>
+      <w:proofErr w:type="spellStart"/>
+      <w:r>
+        <w:t>Незабудьте</w:t>
+      </w:r>
+      <w:proofErr w:type="spellEnd"/>
+      <w:r>
+        <w:rPr>
+          <w:lang w:val="en-US"/>
+        </w:rPr>
+        <w:t xml:space="preserve"> </w:t>
+      </w:r>
+      <w:r>
+        <w:t>определить</w:t>
+      </w:r>
+      <w:r>
+        <w:rPr>
+          <w:lang w:val="en-US"/>
+        </w:rPr>
+        <w:t xml:space="preserve"> </w:t>
+      </w:r>
+      <w:proofErr w:type="spellStart"/>
+      <w:proofErr w:type="gramStart"/>
+      <w:r>
+        <w:rPr>
+          <w:lang w:val="en-US"/>
+        </w:rPr>
+        <w:t>self.learning</w:t>
+      </w:r>
+      <w:proofErr w:type="gramEnd"/>
+      <w:r>
+        <w:rPr>
+          <w:lang w:val="en-US"/>
+        </w:rPr>
+        <w:t>_rate</w:t>
+      </w:r>
+      <w:proofErr w:type="spellEnd"/>
+      <w:r>
+        <w:rPr>
+          <w:lang w:val="en-US"/>
+        </w:rPr>
+        <w:t>,</w:t>
+      </w:r>
+    </w:p>
+    <w:p>
+      <w:pPr>
+        <w:pStyle w:val="af"/>
+        <w:rPr>
+          <w:lang w:val="en-US"/>
+        </w:rPr>
+      </w:pPr>
+      <w:r>
+        <w:rPr>
+          <w:lang w:val="en-US"/>
+        </w:rPr>
+        <w:t xml:space="preserve">        # </w:t>
+      </w:r>
+      <w:proofErr w:type="spellStart"/>
+      <w:proofErr w:type="gramStart"/>
+      <w:r>
+        <w:rPr>
+          <w:lang w:val="en-US"/>
+        </w:rPr>
+        <w:t>self.numTrainingGames</w:t>
+      </w:r>
+      <w:proofErr w:type="spellEnd"/>
+      <w:proofErr w:type="gramEnd"/>
+      <w:r>
+        <w:rPr>
+          <w:lang w:val="en-US"/>
+        </w:rPr>
+        <w:t xml:space="preserve"> </w:t>
+      </w:r>
+      <w:r>
+        <w:t>и</w:t>
+      </w:r>
+      <w:r>
+        <w:rPr>
+          <w:lang w:val="en-US"/>
+        </w:rPr>
+        <w:t xml:space="preserve"> </w:t>
+      </w:r>
+      <w:proofErr w:type="gramStart"/>
+      <w:r>
+        <w:rPr>
+          <w:lang w:val="en-US"/>
+        </w:rPr>
+        <w:t>self.batch</w:t>
+      </w:r>
+      <w:proofErr w:type="gramEnd"/>
+      <w:r>
+        <w:rPr>
+          <w:lang w:val="en-US"/>
+        </w:rPr>
+        <w:t>_size!</w:t>
+      </w:r>
+    </w:p>
+    <w:p>
+      <w:pPr>
+        <w:pStyle w:val="af"/>
+        <w:rPr>
+          <w:lang w:val="en-US"/>
+        </w:rPr>
+      </w:pPr>
+      <w:r>
+        <w:rPr>
+          <w:lang w:val="en-US"/>
+        </w:rPr>
+        <w:t xml:space="preserve">        </w:t>
+      </w:r>
+    </w:p>
+    <w:p>
+      <w:pPr>
+        <w:pStyle w:val="af"/>
+        <w:rPr>
+          <w:lang w:val="en-US"/>
+        </w:rPr>
+      </w:pPr>
+      <w:r>
+        <w:rPr>
+          <w:lang w:val="en-US"/>
+        </w:rPr>
+        <w:t xml:space="preserve">        "*** </w:t>
+      </w:r>
+      <w:r>
+        <w:t>ВСТАВЬТЕ</w:t>
+      </w:r>
+      <w:r>
+        <w:rPr>
+          <w:lang w:val="en-US"/>
+        </w:rPr>
+        <w:t xml:space="preserve"> </w:t>
+      </w:r>
+      <w:r>
+        <w:t>ВАШ</w:t>
+      </w:r>
+      <w:r>
+        <w:rPr>
+          <w:lang w:val="en-US"/>
+        </w:rPr>
+        <w:t xml:space="preserve"> </w:t>
+      </w:r>
+      <w:r>
+        <w:t>КОД</w:t>
+      </w:r>
+      <w:r>
+        <w:rPr>
+          <w:lang w:val="en-US"/>
+        </w:rPr>
+        <w:t xml:space="preserve"> </w:t>
+      </w:r>
+      <w:r>
+        <w:t>СЮДА</w:t>
+      </w:r>
+      <w:r>
+        <w:rPr>
+          <w:lang w:val="en-US"/>
+        </w:rPr>
+        <w:t xml:space="preserve"> ***"</w:t>
+      </w:r>
+    </w:p>
+    <w:p>
+      <w:pPr>
+        <w:pStyle w:val="af"/>
+        <w:rPr>
+          <w:lang w:val="en-US"/>
+        </w:rPr>
+      </w:pPr>
+      <w:r>
+        <w:rPr>
+          <w:lang w:val="en-US"/>
+        </w:rPr>
+        <w:t xml:space="preserve">        </w:t>
+      </w:r>
+    </w:p>
+    <w:p>
+      <w:pPr>
+        <w:pStyle w:val="af"/>
+        <w:rPr>
+          <w:lang w:val="en-US"/>
+        </w:rPr>
+      </w:pPr>
+      <w:r>
+        <w:rPr>
+          <w:lang w:val="en-US"/>
+        </w:rPr>
+        <w:t xml:space="preserve">        </w:t>
+      </w:r>
+      <w:proofErr w:type="spellStart"/>
+      <w:proofErr w:type="gramStart"/>
+      <w:r>
+        <w:rPr>
+          <w:lang w:val="en-US"/>
+        </w:rPr>
+        <w:t>self.learning</w:t>
+      </w:r>
+      <w:proofErr w:type="gramEnd"/>
+      <w:r>
+        <w:rPr>
+          <w:lang w:val="en-US"/>
+        </w:rPr>
+        <w:t>_rate</w:t>
+      </w:r>
+      <w:proofErr w:type="spellEnd"/>
+      <w:r>
+        <w:rPr>
+          <w:lang w:val="en-US"/>
+        </w:rPr>
+        <w:t xml:space="preserve"> = 0.001</w:t>
+      </w:r>
+    </w:p>
+    <w:p>
+      <w:pPr>
+        <w:pStyle w:val="af"/>
+        <w:rPr>
+          <w:lang w:val="en-US"/>
+        </w:rPr>
+      </w:pPr>
+      <w:r>
+        <w:rPr>
+          <w:lang w:val="en-US"/>
+        </w:rPr>
+        <w:t xml:space="preserve">        </w:t>
+      </w:r>
+      <w:proofErr w:type="spellStart"/>
+      <w:proofErr w:type="gramStart"/>
+      <w:r>
+        <w:rPr>
+          <w:lang w:val="en-US"/>
+        </w:rPr>
+        <w:t>self.numTrainingGames</w:t>
+      </w:r>
+      <w:proofErr w:type="spellEnd"/>
+      <w:proofErr w:type="gramEnd"/>
+      <w:r>
+        <w:rPr>
+          <w:lang w:val="en-US"/>
+        </w:rPr>
+        <w:t xml:space="preserve"> = 2500</w:t>
+      </w:r>
+    </w:p>
+    <w:p>
+      <w:pPr>
+        <w:pStyle w:val="af"/>
+      </w:pPr>
+      <w:r>
+        <w:rPr>
+          <w:lang w:val="en-US"/>
+        </w:rPr>
+        <w:t xml:space="preserve">        </w:t>
+      </w:r>
+      <w:proofErr w:type="spellStart"/>
+      <w:proofErr w:type="gramStart"/>
+      <w:r>
+        <w:t>self.batch</w:t>
+      </w:r>
+      <w:proofErr w:type="gramEnd"/>
+      <w:r>
+        <w:t>_size</w:t>
+      </w:r>
+      <w:proofErr w:type="spellEnd"/>
+      <w:r>
+        <w:t xml:space="preserve"> = 64 </w:t>
+      </w:r>
+    </w:p>
+    <w:p>
+      <w:pPr>
+        <w:pStyle w:val="af"/>
+      </w:pPr>
+      <w:r>
+        <w:t xml:space="preserve">        </w:t>
+      </w:r>
+    </w:p>
+    <w:p>
+      <w:pPr>
+        <w:pStyle w:val="af"/>
+      </w:pPr>
+      <w:r>
+        <w:t>        # кол-во нейронов скрытых слоев</w:t>
+      </w:r>
+    </w:p>
+    <w:p>
+      <w:pPr>
+        <w:pStyle w:val="af"/>
+        <w:rPr>
+          <w:lang w:val="en-US"/>
+        </w:rPr>
+      </w:pPr>
+      <w:r>
+        <w:t xml:space="preserve">        </w:t>
+      </w:r>
+      <w:r>
+        <w:rPr>
+          <w:lang w:val="en-US"/>
+        </w:rPr>
+        <w:t>H1 = 512</w:t>
+      </w:r>
+    </w:p>
+    <w:p>
+      <w:pPr>
+        <w:pStyle w:val="af"/>
+        <w:rPr>
+          <w:lang w:val="en-US"/>
+        </w:rPr>
+      </w:pPr>
+      <w:r>
+        <w:rPr>
+          <w:lang w:val="en-US"/>
+        </w:rPr>
+        <w:t>        H2 = 256</w:t>
+      </w:r>
+    </w:p>
+    <w:p>
+      <w:pPr>
+        <w:pStyle w:val="af"/>
+        <w:rPr>
+          <w:lang w:val="en-US"/>
+        </w:rPr>
+      </w:pPr>
+      <w:r>
+        <w:rPr>
+          <w:lang w:val="en-US"/>
+        </w:rPr>
+        <w:t>        #H3 = 128</w:t>
+      </w:r>
+    </w:p>
+    <w:p>
+      <w:pPr>
+        <w:pStyle w:val="af"/>
+        <w:rPr>
+          <w:lang w:val="en-US"/>
+        </w:rPr>
+      </w:pPr>
+    </w:p>
+    <w:p>
+      <w:pPr>
+        <w:pStyle w:val="af"/>
+        <w:rPr>
+          <w:lang w:val="en-US"/>
+        </w:rPr>
+      </w:pPr>
+      <w:r>
+        <w:rPr>
+          <w:lang w:val="en-US"/>
+        </w:rPr>
+        <w:t xml:space="preserve">        </w:t>
+      </w:r>
+      <w:proofErr w:type="gramStart"/>
+      <w:r>
+        <w:rPr>
+          <w:lang w:val="en-US"/>
+        </w:rPr>
+        <w:t>self.layer</w:t>
+      </w:r>
+      <w:proofErr w:type="gramEnd"/>
+      <w:r>
+        <w:rPr>
+          <w:lang w:val="en-US"/>
+        </w:rPr>
+        <w:t xml:space="preserve">1 = </w:t>
+      </w:r>
+      <w:proofErr w:type="gramStart"/>
+      <w:r>
+        <w:rPr>
+          <w:lang w:val="en-US"/>
+        </w:rPr>
+        <w:t>Linear(</w:t>
+      </w:r>
+      <w:proofErr w:type="spellStart"/>
+      <w:r>
+        <w:rPr>
+          <w:lang w:val="en-US"/>
+        </w:rPr>
+        <w:t>self.state</w:t>
+      </w:r>
+      <w:proofErr w:type="gramEnd"/>
+      <w:r>
+        <w:rPr>
+          <w:lang w:val="en-US"/>
+        </w:rPr>
+        <w:t>_size</w:t>
+      </w:r>
+      <w:proofErr w:type="spellEnd"/>
+      <w:r>
+        <w:rPr>
+          <w:lang w:val="en-US"/>
+        </w:rPr>
+        <w:t>, H1)</w:t>
+      </w:r>
+    </w:p>
+    <w:p>
+      <w:pPr>
+        <w:pStyle w:val="af"/>
+        <w:rPr>
+          <w:lang w:val="en-US"/>
+        </w:rPr>
+      </w:pPr>
+      <w:r>
+        <w:rPr>
+          <w:lang w:val="en-US"/>
+        </w:rPr>
+        <w:t xml:space="preserve">        </w:t>
+      </w:r>
+      <w:proofErr w:type="gramStart"/>
+      <w:r>
+        <w:rPr>
+          <w:lang w:val="en-US"/>
+        </w:rPr>
+        <w:t>self.layer</w:t>
+      </w:r>
+      <w:proofErr w:type="gramEnd"/>
+      <w:r>
+        <w:rPr>
+          <w:lang w:val="en-US"/>
+        </w:rPr>
+        <w:t xml:space="preserve">2 = </w:t>
+      </w:r>
+      <w:proofErr w:type="gramStart"/>
+      <w:r>
+        <w:rPr>
+          <w:lang w:val="en-US"/>
+        </w:rPr>
+        <w:t>Linear(</w:t>
+      </w:r>
+      <w:proofErr w:type="gramEnd"/>
+      <w:r>
+        <w:rPr>
+          <w:lang w:val="en-US"/>
+        </w:rPr>
+        <w:t>H1, H2)</w:t>
+      </w:r>
+    </w:p>
+    <w:p>
+      <w:pPr>
+        <w:pStyle w:val="af"/>
+        <w:rPr>
+          <w:lang w:val="en-US"/>
+        </w:rPr>
+      </w:pPr>
+      <w:r>
+        <w:rPr>
+          <w:lang w:val="en-US"/>
+        </w:rPr>
+        <w:t xml:space="preserve">        </w:t>
+      </w:r>
+      <w:proofErr w:type="gramStart"/>
+      <w:r>
+        <w:rPr>
+          <w:lang w:val="en-US"/>
+        </w:rPr>
+        <w:t>self.layer</w:t>
+      </w:r>
+      <w:proofErr w:type="gramEnd"/>
+      <w:r>
+        <w:rPr>
+          <w:lang w:val="en-US"/>
+        </w:rPr>
+        <w:t xml:space="preserve">3 = </w:t>
+      </w:r>
+      <w:proofErr w:type="gramStart"/>
+      <w:r>
+        <w:rPr>
+          <w:lang w:val="en-US"/>
+        </w:rPr>
+        <w:t>Linear(</w:t>
+      </w:r>
+      <w:proofErr w:type="gramEnd"/>
+      <w:r>
+        <w:rPr>
+          <w:lang w:val="en-US"/>
+        </w:rPr>
+        <w:t xml:space="preserve">H2, </w:t>
+      </w:r>
+      <w:proofErr w:type="spellStart"/>
+      <w:r>
+        <w:rPr>
+          <w:lang w:val="en-US"/>
+        </w:rPr>
+        <w:t>self.num_actions</w:t>
+      </w:r>
+      <w:proofErr w:type="spellEnd"/>
+      <w:r>
+        <w:rPr>
+          <w:lang w:val="en-US"/>
+        </w:rPr>
+        <w:t>)</w:t>
+      </w:r>
+    </w:p>
+    <w:p>
+      <w:pPr>
+        <w:pStyle w:val="af"/>
+        <w:rPr>
+          <w:lang w:val="en-US"/>
+        </w:rPr>
+      </w:pPr>
+    </w:p>
+    <w:p>
+      <w:pPr>
+        <w:pStyle w:val="af"/>
+        <w:rPr>
+          <w:lang w:val="en-US"/>
+        </w:rPr>
+      </w:pPr>
+      <w:r>
+        <w:rPr>
+          <w:lang w:val="en-US"/>
+        </w:rPr>
+        <w:t xml:space="preserve">        # </w:t>
+      </w:r>
+      <w:r>
+        <w:t>оптимизатор</w:t>
+      </w:r>
+    </w:p>
+    <w:p>
+      <w:pPr>
+        <w:pStyle w:val="af"/>
+        <w:rPr>
+          <w:lang w:val="en-US"/>
+        </w:rPr>
+      </w:pPr>
+      <w:r>
+        <w:rPr>
+          <w:lang w:val="en-US"/>
+        </w:rPr>
+        <w:t>       </w:t>
+      </w:r>
+      <w:proofErr w:type="spellStart"/>
+      <w:proofErr w:type="gramStart"/>
+      <w:r>
+        <w:rPr>
+          <w:lang w:val="en-US"/>
+        </w:rPr>
+        <w:t>self.optimizer</w:t>
+      </w:r>
+      <w:proofErr w:type="spellEnd"/>
+      <w:proofErr w:type="gramEnd"/>
+      <w:r>
+        <w:rPr>
+          <w:lang w:val="en-US"/>
+        </w:rPr>
+        <w:t xml:space="preserve"> = </w:t>
+      </w:r>
+      <w:proofErr w:type="spellStart"/>
+      <w:proofErr w:type="gramStart"/>
+      <w:r>
+        <w:rPr>
+          <w:lang w:val="en-US"/>
+        </w:rPr>
+        <w:t>optim.Adam</w:t>
+      </w:r>
+      <w:proofErr w:type="spellEnd"/>
+      <w:proofErr w:type="gramEnd"/>
+      <w:r>
+        <w:rPr>
+          <w:lang w:val="en-US"/>
+        </w:rPr>
+        <w:t>(</w:t>
+      </w:r>
+      <w:proofErr w:type="spellStart"/>
+      <w:proofErr w:type="gramStart"/>
+      <w:r>
+        <w:rPr>
+          <w:lang w:val="en-US"/>
+        </w:rPr>
+        <w:t>self.parameters</w:t>
+      </w:r>
+      <w:proofErr w:type="spellEnd"/>
+      <w:proofErr w:type="gramEnd"/>
+      <w:r>
+        <w:rPr>
+          <w:lang w:val="en-US"/>
+        </w:rPr>
+        <w:t xml:space="preserve">(), </w:t>
+      </w:r>
+      <w:proofErr w:type="spellStart"/>
+      <w:r>
+        <w:rPr>
+          <w:lang w:val="en-US"/>
+        </w:rPr>
+        <w:t>lr</w:t>
+      </w:r>
+      <w:proofErr w:type="spellEnd"/>
+      <w:r>
+        <w:rPr>
+          <w:lang w:val="en-US"/>
+        </w:rPr>
+        <w:t>=</w:t>
+      </w:r>
+      <w:proofErr w:type="spellStart"/>
+      <w:proofErr w:type="gramStart"/>
+      <w:r>
+        <w:rPr>
+          <w:lang w:val="en-US"/>
+        </w:rPr>
+        <w:t>self.learning</w:t>
+      </w:r>
+      <w:proofErr w:type="gramEnd"/>
+      <w:r>
+        <w:rPr>
+          <w:lang w:val="en-US"/>
+        </w:rPr>
+        <w:t>_rate</w:t>
+      </w:r>
+      <w:proofErr w:type="spellEnd"/>
+      <w:r>
+        <w:rPr>
+          <w:lang w:val="en-US"/>
+        </w:rPr>
+        <w:t>)</w:t>
+      </w:r>
+    </w:p>
+    <w:p>
+      <w:pPr>
+        <w:pStyle w:val="af"/>
+        <w:rPr>
+          <w:lang w:val="en-US"/>
+        </w:rPr>
+      </w:pPr>
+    </w:p>
+    <w:p>
+      <w:pPr>
+        <w:pStyle w:val="af"/>
+        <w:rPr>
+          <w:lang w:val="en-US"/>
+        </w:rPr>
+      </w:pPr>
+      <w:r>
+        <w:rPr>
+          <w:lang w:val="en-US"/>
+        </w:rPr>
+        <w:t xml:space="preserve">        </w:t>
+      </w:r>
+      <w:proofErr w:type="spellStart"/>
+      <w:proofErr w:type="gramStart"/>
+      <w:r>
+        <w:rPr>
+          <w:lang w:val="en-US"/>
+        </w:rPr>
+        <w:t>self.double</w:t>
+      </w:r>
+      <w:proofErr w:type="spellEnd"/>
+      <w:proofErr w:type="gramEnd"/>
+      <w:r>
+        <w:rPr>
+          <w:lang w:val="en-US"/>
+        </w:rPr>
+        <w:t>()</w:t>
+      </w:r>
+    </w:p>
+    <w:p>
+      <w:pPr>
+        <w:pStyle w:val="af"/>
+        <w:rPr>
+          <w:lang w:val="en-US"/>
+        </w:rPr>
+      </w:pPr>
+      <w:r>
+        <w:rPr>
+          <w:lang w:val="en-US"/>
+        </w:rPr>
+        <w:lastRenderedPageBreak/>
+        <w:t> </w:t>
+      </w:r>
+    </w:p>
+    <w:p>
+      <w:pPr>
+        <w:pStyle w:val="af"/>
+        <w:rPr>
+          <w:lang w:val="en-US"/>
+        </w:rPr>
+      </w:pPr>
+      <w:r>
+        <w:rPr>
+          <w:lang w:val="en-US"/>
+        </w:rPr>
+        <w:t xml:space="preserve">    def </w:t>
+      </w:r>
+      <w:proofErr w:type="gramStart"/>
+      <w:r>
+        <w:rPr>
+          <w:lang w:val="en-US"/>
+        </w:rPr>
+        <w:t>forward(</w:t>
+      </w:r>
+      <w:proofErr w:type="gramEnd"/>
+      <w:r>
+        <w:rPr>
+          <w:lang w:val="en-US"/>
+        </w:rPr>
+        <w:t>self, states):</w:t>
+      </w:r>
+    </w:p>
+    <w:p>
+      <w:pPr>
+        <w:pStyle w:val="af"/>
+        <w:rPr>
+          <w:lang w:val="en-US"/>
+        </w:rPr>
+      </w:pPr>
+      <w:r>
+        <w:rPr>
+          <w:lang w:val="en-US"/>
+        </w:rPr>
+        <w:t xml:space="preserve">        x = </w:t>
+      </w:r>
+      <w:proofErr w:type="spellStart"/>
+      <w:r>
+        <w:rPr>
+          <w:lang w:val="en-US"/>
+        </w:rPr>
+        <w:t>relu</w:t>
+      </w:r>
+      <w:proofErr w:type="spellEnd"/>
+      <w:r>
+        <w:rPr>
+          <w:lang w:val="en-US"/>
+        </w:rPr>
+        <w:t>(</w:t>
+      </w:r>
+      <w:proofErr w:type="gramStart"/>
+      <w:r>
+        <w:rPr>
+          <w:lang w:val="en-US"/>
+        </w:rPr>
+        <w:t>self.layer</w:t>
+      </w:r>
+      <w:proofErr w:type="gramEnd"/>
+      <w:r>
+        <w:rPr>
+          <w:lang w:val="en-US"/>
+        </w:rPr>
+        <w:t>1(states))</w:t>
+      </w:r>
+    </w:p>
+    <w:p>
+      <w:pPr>
+        <w:pStyle w:val="af"/>
+        <w:rPr>
+          <w:lang w:val="en-US"/>
+        </w:rPr>
+      </w:pPr>
+      <w:r>
+        <w:rPr>
+          <w:lang w:val="en-US"/>
+        </w:rPr>
+        <w:t xml:space="preserve">        x = </w:t>
+      </w:r>
+      <w:proofErr w:type="spellStart"/>
+      <w:r>
+        <w:rPr>
+          <w:lang w:val="en-US"/>
+        </w:rPr>
+        <w:t>relu</w:t>
+      </w:r>
+      <w:proofErr w:type="spellEnd"/>
+      <w:r>
+        <w:rPr>
+          <w:lang w:val="en-US"/>
+        </w:rPr>
+        <w:t>(</w:t>
+      </w:r>
+      <w:proofErr w:type="gramStart"/>
+      <w:r>
+        <w:rPr>
+          <w:lang w:val="en-US"/>
+        </w:rPr>
+        <w:t>self.layer</w:t>
+      </w:r>
+      <w:proofErr w:type="gramEnd"/>
+      <w:r>
+        <w:rPr>
+          <w:lang w:val="en-US"/>
+        </w:rPr>
+        <w:t>2(x))</w:t>
+      </w:r>
+    </w:p>
+    <w:p>
+      <w:pPr>
+        <w:pStyle w:val="af"/>
+        <w:rPr>
+          <w:lang w:val="en-US"/>
+        </w:rPr>
+      </w:pPr>
+      <w:r>
+        <w:rPr>
+          <w:lang w:val="en-US"/>
+        </w:rPr>
+        <w:t xml:space="preserve">        x = </w:t>
+      </w:r>
+      <w:proofErr w:type="gramStart"/>
+      <w:r>
+        <w:rPr>
+          <w:lang w:val="en-US"/>
+        </w:rPr>
+        <w:t>self.layer</w:t>
+      </w:r>
+      <w:proofErr w:type="gramEnd"/>
+      <w:r>
+        <w:rPr>
+          <w:lang w:val="en-US"/>
+        </w:rPr>
+        <w:t>3(x)</w:t>
+      </w:r>
+    </w:p>
+    <w:p>
+      <w:pPr>
+        <w:pStyle w:val="af"/>
+        <w:rPr>
+          <w:lang w:val="en-US"/>
+        </w:rPr>
+      </w:pPr>
+      <w:r>
+        <w:rPr>
+          <w:lang w:val="en-US"/>
+        </w:rPr>
+        <w:t xml:space="preserve">        </w:t>
+      </w:r>
+    </w:p>
+    <w:p>
+      <w:pPr>
+        <w:pStyle w:val="af"/>
+        <w:rPr>
+          <w:lang w:val="en-US"/>
+        </w:rPr>
+      </w:pPr>
+      <w:r>
+        <w:rPr>
+          <w:lang w:val="en-US"/>
+        </w:rPr>
+        <w:t>        return x</w:t>
+      </w:r>
+    </w:p>
+    <w:p>
+      <w:pPr>
+        <w:pStyle w:val="af"/>
+        <w:rPr>
+          <w:lang w:val="en-US"/>
+        </w:rPr>
+      </w:pPr>
+      <w:r>
+        <w:rPr>
+          <w:lang w:val="en-US"/>
+        </w:rPr>
+        <w:t xml:space="preserve">    </w:t>
+      </w:r>
+    </w:p>
+    <w:p>
+      <w:pPr>
+        <w:pStyle w:val="af"/>
+      </w:pPr>
+      <w:r>
+        <w:rPr>
+          <w:lang w:val="en-US"/>
+        </w:rPr>
+        <w:t xml:space="preserve">    </w:t>
+      </w:r>
+      <w:proofErr w:type="spellStart"/>
+      <w:r>
+        <w:t>def</w:t>
+      </w:r>
+      <w:proofErr w:type="spellEnd"/>
+      <w:r>
+        <w:t xml:space="preserve"> </w:t>
+      </w:r>
+      <w:proofErr w:type="spellStart"/>
+      <w:proofErr w:type="gramStart"/>
+      <w:r>
+        <w:rPr>
+          <w:b/>
+          <w:bCs/>
+        </w:rPr>
+        <w:t>run</w:t>
+      </w:r>
+      <w:proofErr w:type="spellEnd"/>
+      <w:r>
+        <w:t>(</w:t>
+      </w:r>
+      <w:proofErr w:type="spellStart"/>
+      <w:proofErr w:type="gramEnd"/>
+      <w:r>
+        <w:t>self</w:t>
+      </w:r>
+      <w:proofErr w:type="spellEnd"/>
+      <w:r>
+        <w:t xml:space="preserve">, </w:t>
+      </w:r>
+      <w:proofErr w:type="spellStart"/>
+      <w:r>
+        <w:t>states</w:t>
+      </w:r>
+      <w:proofErr w:type="spellEnd"/>
+      <w:r>
+        <w:t>):</w:t>
+      </w:r>
+    </w:p>
+    <w:p>
+      <w:pPr>
+        <w:pStyle w:val="af"/>
+      </w:pPr>
+      <w:r>
+        <w:t>        # Метод необходим для совместимости кода с другими модулями</w:t>
+      </w:r>
+    </w:p>
+    <w:p>
+      <w:pPr>
+        <w:pStyle w:val="af"/>
+        <w:rPr>
+          <w:lang w:val="en-US"/>
+        </w:rPr>
+      </w:pPr>
+      <w:r>
+        <w:t xml:space="preserve">        </w:t>
+      </w:r>
+      <w:r>
+        <w:rPr>
+          <w:lang w:val="en-US"/>
+        </w:rPr>
+        <w:t xml:space="preserve">return </w:t>
+      </w:r>
+      <w:proofErr w:type="spellStart"/>
+      <w:r>
+        <w:rPr>
+          <w:lang w:val="en-US"/>
+        </w:rPr>
+        <w:t>self.forward</w:t>
+      </w:r>
+      <w:proofErr w:type="spellEnd"/>
+      <w:r>
+        <w:rPr>
+          <w:lang w:val="en-US"/>
+        </w:rPr>
+        <w:t>(states)</w:t>
+      </w:r>
+    </w:p>
+    <w:p>
+      <w:pPr>
+        <w:pStyle w:val="af"/>
+        <w:rPr>
+          <w:lang w:val="en-US"/>
+        </w:rPr>
+      </w:pPr>
+      <w:r>
+        <w:rPr>
+          <w:lang w:val="en-US"/>
+        </w:rPr>
+        <w:t xml:space="preserve">    </w:t>
+      </w:r>
+    </w:p>
+    <w:p>
+      <w:pPr>
+        <w:pStyle w:val="af"/>
+        <w:rPr>
+          <w:lang w:val="en-US"/>
+        </w:rPr>
+      </w:pPr>
+      <w:r>
+        <w:rPr>
+          <w:lang w:val="en-US"/>
+        </w:rPr>
+        <w:t xml:space="preserve">    def </w:t>
+      </w:r>
+      <w:proofErr w:type="spellStart"/>
+      <w:r>
+        <w:rPr>
+          <w:b/>
+          <w:bCs/>
+          <w:lang w:val="en-US"/>
+        </w:rPr>
+        <w:t>get_</w:t>
+      </w:r>
+      <w:proofErr w:type="gramStart"/>
+      <w:r>
+        <w:rPr>
+          <w:b/>
+          <w:bCs/>
+          <w:lang w:val="en-US"/>
+        </w:rPr>
+        <w:t>loss</w:t>
+      </w:r>
+      <w:proofErr w:type="spellEnd"/>
+      <w:r>
+        <w:rPr>
+          <w:lang w:val="en-US"/>
+        </w:rPr>
+        <w:t>(</w:t>
+      </w:r>
+      <w:proofErr w:type="gramEnd"/>
+      <w:r>
+        <w:rPr>
+          <w:lang w:val="en-US"/>
+        </w:rPr>
+        <w:t xml:space="preserve">self, states, </w:t>
+      </w:r>
+      <w:proofErr w:type="spellStart"/>
+      <w:r>
+        <w:rPr>
+          <w:lang w:val="en-US"/>
+        </w:rPr>
+        <w:t>Q_target</w:t>
+      </w:r>
+      <w:proofErr w:type="spellEnd"/>
+      <w:r>
+        <w:rPr>
+          <w:lang w:val="en-US"/>
+        </w:rPr>
+        <w:t>):</w:t>
+      </w:r>
+    </w:p>
+    <w:p>
+      <w:pPr>
+        <w:pStyle w:val="af"/>
+        <w:rPr>
+          <w:lang w:val="en-US"/>
+        </w:rPr>
+      </w:pPr>
+      <w:r>
+        <w:rPr>
+          <w:lang w:val="en-US"/>
+        </w:rPr>
+        <w:t xml:space="preserve">        </w:t>
+      </w:r>
+      <w:proofErr w:type="spellStart"/>
+      <w:r>
+        <w:rPr>
+          <w:lang w:val="en-US"/>
+        </w:rPr>
+        <w:t>q_pred</w:t>
+      </w:r>
+      <w:proofErr w:type="spellEnd"/>
+      <w:r>
+        <w:rPr>
+          <w:lang w:val="en-US"/>
+        </w:rPr>
+        <w:t xml:space="preserve"> = </w:t>
+      </w:r>
+      <w:proofErr w:type="spellStart"/>
+      <w:r>
+        <w:rPr>
+          <w:lang w:val="en-US"/>
+        </w:rPr>
+        <w:t>self.forward</w:t>
+      </w:r>
+      <w:proofErr w:type="spellEnd"/>
+      <w:r>
+        <w:rPr>
+          <w:lang w:val="en-US"/>
+        </w:rPr>
+        <w:t>(states)</w:t>
+      </w:r>
+    </w:p>
+    <w:p>
+      <w:pPr>
+        <w:pStyle w:val="af"/>
+        <w:rPr>
+          <w:lang w:val="en-US"/>
+        </w:rPr>
+      </w:pPr>
+      <w:r>
+        <w:rPr>
+          <w:lang w:val="en-US"/>
+        </w:rPr>
+        <w:t xml:space="preserve">        </w:t>
+      </w:r>
+      <w:proofErr w:type="spellStart"/>
+      <w:r>
+        <w:rPr>
+          <w:lang w:val="en-US"/>
+        </w:rPr>
+        <w:t>mse</w:t>
+      </w:r>
+      <w:proofErr w:type="spellEnd"/>
+      <w:r>
+        <w:rPr>
+          <w:lang w:val="en-US"/>
+        </w:rPr>
+        <w:t xml:space="preserve"> = </w:t>
+      </w:r>
+      <w:proofErr w:type="spellStart"/>
+      <w:r>
+        <w:rPr>
+          <w:lang w:val="en-US"/>
+        </w:rPr>
+        <w:t>mse_</w:t>
+      </w:r>
+      <w:proofErr w:type="gramStart"/>
+      <w:r>
+        <w:rPr>
+          <w:lang w:val="en-US"/>
+        </w:rPr>
+        <w:t>loss</w:t>
+      </w:r>
+      <w:proofErr w:type="spellEnd"/>
+      <w:r>
+        <w:rPr>
+          <w:lang w:val="en-US"/>
+        </w:rPr>
+        <w:t>(</w:t>
+      </w:r>
+      <w:proofErr w:type="spellStart"/>
+      <w:proofErr w:type="gramEnd"/>
+      <w:r>
+        <w:rPr>
+          <w:lang w:val="en-US"/>
+        </w:rPr>
+        <w:t>q_pred</w:t>
+      </w:r>
+      <w:proofErr w:type="spellEnd"/>
+      <w:r>
+        <w:rPr>
+          <w:lang w:val="en-US"/>
+        </w:rPr>
+        <w:t xml:space="preserve">, </w:t>
+      </w:r>
+      <w:proofErr w:type="spellStart"/>
+      <w:r>
+        <w:rPr>
+          <w:lang w:val="en-US"/>
+        </w:rPr>
+        <w:t>Q_target</w:t>
+      </w:r>
+      <w:proofErr w:type="spellEnd"/>
+      <w:r>
+        <w:rPr>
+          <w:lang w:val="en-US"/>
+        </w:rPr>
+        <w:t>)</w:t>
+      </w:r>
+    </w:p>
+    <w:p>
+      <w:pPr>
+        <w:pStyle w:val="af"/>
+        <w:rPr>
+          <w:lang w:val="en-US"/>
+        </w:rPr>
+      </w:pPr>
+      <w:r>
+        <w:rPr>
+          <w:lang w:val="en-US"/>
+        </w:rPr>
+        <w:t xml:space="preserve">        return </w:t>
+      </w:r>
+      <w:proofErr w:type="spellStart"/>
+      <w:r>
+        <w:rPr>
+          <w:lang w:val="en-US"/>
+        </w:rPr>
+        <w:t>mse</w:t>
+      </w:r>
+      <w:proofErr w:type="spellEnd"/>
+    </w:p>
+    <w:p>
+      <w:pPr>
+        <w:pStyle w:val="af"/>
+        <w:rPr>
+          <w:lang w:val="en-US"/>
+        </w:rPr>
+      </w:pPr>
+      <w:r>
+        <w:rPr>
+          <w:lang w:val="en-US"/>
+        </w:rPr>
+        <w:t xml:space="preserve">    </w:t>
+      </w:r>
+    </w:p>
+    <w:p>
+      <w:pPr>
+        <w:pStyle w:val="af"/>
+        <w:rPr>
+          <w:lang w:val="en-US"/>
+        </w:rPr>
+      </w:pPr>
+    </w:p>
+    <w:p>
+      <w:pPr>
+        <w:pStyle w:val="af"/>
+        <w:rPr>
+          <w:lang w:val="en-US"/>
+        </w:rPr>
+      </w:pPr>
+      <w:r>
+        <w:rPr>
+          <w:lang w:val="en-US"/>
+        </w:rPr>
+        <w:t xml:space="preserve">    def </w:t>
+      </w:r>
+      <w:proofErr w:type="spellStart"/>
+      <w:r>
+        <w:rPr>
+          <w:b/>
+          <w:bCs/>
+          <w:lang w:val="en-US"/>
+        </w:rPr>
+        <w:t>gradient_</w:t>
+      </w:r>
+      <w:proofErr w:type="gramStart"/>
+      <w:r>
+        <w:rPr>
+          <w:b/>
+          <w:bCs/>
+          <w:lang w:val="en-US"/>
+        </w:rPr>
+        <w:t>update</w:t>
+      </w:r>
+      <w:proofErr w:type="spellEnd"/>
+      <w:r>
+        <w:rPr>
+          <w:lang w:val="en-US"/>
+        </w:rPr>
+        <w:t>(</w:t>
+      </w:r>
+      <w:proofErr w:type="gramEnd"/>
+      <w:r>
+        <w:rPr>
+          <w:lang w:val="en-US"/>
+        </w:rPr>
+        <w:t xml:space="preserve">self, states, </w:t>
+      </w:r>
+      <w:proofErr w:type="spellStart"/>
+      <w:r>
+        <w:rPr>
+          <w:lang w:val="en-US"/>
+        </w:rPr>
+        <w:t>Q_target</w:t>
+      </w:r>
+      <w:proofErr w:type="spellEnd"/>
+      <w:r>
+        <w:rPr>
+          <w:lang w:val="en-US"/>
+        </w:rPr>
+        <w:t>):</w:t>
+      </w:r>
+    </w:p>
+    <w:p>
+      <w:pPr>
+        <w:pStyle w:val="af"/>
+        <w:rPr>
+          <w:lang w:val="en-US"/>
+        </w:rPr>
+      </w:pPr>
+      <w:r>
+        <w:rPr>
+          <w:lang w:val="en-US"/>
+        </w:rPr>
+        <w:t xml:space="preserve">        loss = </w:t>
+      </w:r>
+      <w:proofErr w:type="spellStart"/>
+      <w:r>
+        <w:rPr>
+          <w:lang w:val="en-US"/>
+        </w:rPr>
+        <w:t>self.get_</w:t>
+      </w:r>
+      <w:proofErr w:type="gramStart"/>
+      <w:r>
+        <w:rPr>
+          <w:lang w:val="en-US"/>
+        </w:rPr>
+        <w:t>loss</w:t>
+      </w:r>
+      <w:proofErr w:type="spellEnd"/>
+      <w:r>
+        <w:rPr>
+          <w:lang w:val="en-US"/>
+        </w:rPr>
+        <w:t>(</w:t>
+      </w:r>
+      <w:proofErr w:type="gramEnd"/>
+      <w:r>
+        <w:rPr>
+          <w:lang w:val="en-US"/>
+        </w:rPr>
+        <w:t xml:space="preserve">states, </w:t>
+      </w:r>
+      <w:proofErr w:type="spellStart"/>
+      <w:r>
+        <w:rPr>
+          <w:lang w:val="en-US"/>
+        </w:rPr>
+        <w:t>Q_target</w:t>
+      </w:r>
+      <w:proofErr w:type="spellEnd"/>
+      <w:r>
+        <w:rPr>
+          <w:lang w:val="en-US"/>
+        </w:rPr>
+        <w:t>)</w:t>
+      </w:r>
+    </w:p>
+    <w:p>
+      <w:pPr>
+        <w:pStyle w:val="af"/>
+        <w:rPr>
+          <w:lang w:val="en-US"/>
+        </w:rPr>
+      </w:pPr>
+      <w:r>
+        <w:rPr>
+          <w:lang w:val="en-US"/>
+        </w:rPr>
+        <w:t xml:space="preserve">        </w:t>
+      </w:r>
+      <w:proofErr w:type="spellStart"/>
+      <w:proofErr w:type="gramStart"/>
+      <w:r>
+        <w:rPr>
+          <w:lang w:val="en-US"/>
+        </w:rPr>
+        <w:t>self.optimizer</w:t>
+      </w:r>
+      <w:proofErr w:type="gramEnd"/>
+      <w:r>
+        <w:rPr>
+          <w:lang w:val="en-US"/>
+        </w:rPr>
+        <w:t>.zero_</w:t>
+      </w:r>
+      <w:proofErr w:type="gramStart"/>
+      <w:r>
+        <w:rPr>
+          <w:lang w:val="en-US"/>
+        </w:rPr>
+        <w:t>grad</w:t>
+      </w:r>
+      <w:proofErr w:type="spellEnd"/>
+      <w:r>
+        <w:rPr>
+          <w:lang w:val="en-US"/>
+        </w:rPr>
+        <w:t>(</w:t>
+      </w:r>
+      <w:proofErr w:type="gramEnd"/>
+      <w:r>
+        <w:rPr>
+          <w:lang w:val="en-US"/>
+        </w:rPr>
+        <w:t>)</w:t>
+      </w:r>
+    </w:p>
+    <w:p>
+      <w:pPr>
+        <w:pStyle w:val="af"/>
+        <w:rPr>
+          <w:lang w:val="en-US"/>
+        </w:rPr>
+      </w:pPr>
+      <w:r>
+        <w:rPr>
+          <w:lang w:val="en-US"/>
+        </w:rPr>
+        <w:t xml:space="preserve">        </w:t>
+      </w:r>
+      <w:proofErr w:type="spellStart"/>
+      <w:proofErr w:type="gramStart"/>
+      <w:r>
+        <w:rPr>
+          <w:lang w:val="en-US"/>
+        </w:rPr>
+        <w:t>loss.backward</w:t>
+      </w:r>
+      <w:proofErr w:type="spellEnd"/>
+      <w:proofErr w:type="gramEnd"/>
+      <w:r>
+        <w:rPr>
+          <w:lang w:val="en-US"/>
+        </w:rPr>
+        <w:t>()</w:t>
+      </w:r>
+    </w:p>
+    <w:p>
+      <w:pPr>
+        <w:pStyle w:val="af"/>
+      </w:pPr>
+      <w:r>
+        <w:rPr>
+          <w:lang w:val="en-US"/>
+        </w:rPr>
+        <w:t xml:space="preserve">        </w:t>
+      </w:r>
+      <w:proofErr w:type="spellStart"/>
+      <w:proofErr w:type="gramStart"/>
+      <w:r>
+        <w:t>self.optimizer</w:t>
+      </w:r>
+      <w:proofErr w:type="gramEnd"/>
+      <w:r>
+        <w:t>.</w:t>
+      </w:r>
+      <w:proofErr w:type="gramStart"/>
+      <w:r>
+        <w:t>step</w:t>
+      </w:r>
+      <w:proofErr w:type="spellEnd"/>
+      <w:r>
+        <w:t>(</w:t>
+      </w:r>
+      <w:proofErr w:type="gramEnd"/>
+      <w:r>
+        <w:t>)</w:t>
+      </w:r>
+    </w:p>
+    <w:p/>
+    <w:p>
+      <w:r>
+        <w:t>Не с первого раза, однако реализация нейросети успешно прошла автооценивание</w:t>
+      </w:r>
+      <w:r>
+        <w:t xml:space="preserve"> (рисунок 3.7). Из 10 тестов было успешно пройдено </w:t>
+      </w:r>
+      <w:r>
+        <w:t>8</w:t>
+      </w:r>
+      <w:r>
+        <w:t xml:space="preserve">, </w:t>
+      </w:r>
+      <w:r>
+        <w:t>что даже больше ожидаемого минимума</w:t>
+      </w:r>
+      <w:r>
+        <w:t>.</w:t>
+      </w:r>
+    </w:p>
+    <w:p>
+      <w:pPr>
+        <w:ind w:firstLine="0"/>
+        <w:jc w:val="center"/>
+      </w:pPr>
+    </w:p>
+    <w:p>
+      <w:pPr>
+        <w:ind w:firstLine="0"/>
+        <w:jc w:val="center"/>
+      </w:pPr>
+      <w:r>
+        <w:rPr>
+          <w:noProof/>
+        </w:rPr>
+        <w:drawing>
+          <wp:inline distT="0" distB="0" distL="0" distR="0" wp14:anchorId="6D05BC5E" wp14:editId="6D7A6E8E">
+            <wp:extent cx="5194793" cy="3594100"/>
+            <wp:effectExtent l="0" t="0" r="0" b="0"/>
+            <wp:docPr id="1314340885" name="Рисунок 1"/>
+            <wp:cNvGraphicFramePr>
+              <a:graphicFrameLocks xmlns:a="http://schemas.openxmlformats.org/drawingml/2006/main" noChangeAspect="1"/>
+            </wp:cNvGraphicFramePr>
+            <a:graphic xmlns:a="http://schemas.openxmlformats.org/drawingml/2006/main">
+              <a:graphicData uri="http://schemas.openxmlformats.org/drawingml/2006/picture">
+                <pic:pic xmlns:pic="http://schemas.openxmlformats.org/drawingml/2006/picture">
+                  <pic:nvPicPr>
+                    <pic:cNvPr id="1314340885" name=""/>
+                    <pic:cNvPicPr/>
+                  </pic:nvPicPr>
+                  <pic:blipFill>
+                    <a:blip r:embed="rId16"/>
+                    <a:stretch>
+                      <a:fillRect/>
+                    </a:stretch>
+                  </pic:blipFill>
+                  <pic:spPr>
+                    <a:xfrm>
+                      <a:off x="0" y="0"/>
+                      <a:ext cx="5207724" cy="3603047"/>
+                    </a:xfrm>
+                    <a:prstGeom prst="rect">
+                      <a:avLst/>
+                    </a:prstGeom>
+                  </pic:spPr>
+                </pic:pic>
+              </a:graphicData>
+            </a:graphic>
+          </wp:inline>
+        </w:drawing>
+      </w:r>
+      <w:r>
+        <w:t xml:space="preserve"> </w:t>
+      </w:r>
+    </w:p>
+    <w:p>
+      <w:pPr>
+        <w:ind w:firstLine="0"/>
+        <w:jc w:val="center"/>
+      </w:pPr>
+      <w:r>
+        <w:t xml:space="preserve">Рисунок 3.7 – Автооценивание класса </w:t>
+      </w:r>
+      <w:proofErr w:type="spellStart"/>
+      <w:r>
+        <w:rPr>
+          <w:rFonts w:ascii="Courier New" w:hAnsi="Courier New" w:cs="Courier New"/>
+          <w:sz w:val="24"/>
+          <w:szCs w:val="20"/>
+        </w:rPr>
+        <w:t>DeepQNetwork</w:t>
+      </w:r>
+      <w:proofErr w:type="spellEnd"/>
+    </w:p>
+    <w:p/>
+    <w:p/>
     <w:p>
       <w:pPr>
         <w:pStyle w:val="1"/>
@@ -11242,6 +13430,7 @@
         </w:numPr>
       </w:pPr>
       <w:r>
+        <w:lastRenderedPageBreak/>
         <w:t>ВЫВОД</w:t>
       </w:r>
     </w:p>
@@ -11251,19 +13440,94 @@
       </w:pPr>
     </w:p>
     <w:p>
+      <w:r>
+        <w:t>В ходе работы были и</w:t>
+      </w:r>
+      <w:r>
+        <w:t>сследован</w:t>
+      </w:r>
+      <w:r>
+        <w:t>ы</w:t>
+      </w:r>
+      <w:r>
+        <w:t xml:space="preserve"> метод</w:t>
+      </w:r>
+      <w:r>
+        <w:t>ы</w:t>
+      </w:r>
+      <w:r>
+        <w:t xml:space="preserve"> недетерминированного поиска решений задач</w:t>
+      </w:r>
+      <w:r>
+        <w:t xml:space="preserve">, изучено устройство марковских процессов принятия решений. Освоены методы итеративного поиска оптимальных политик, пассивные и активные алгоритмы обучения с подкреплением. </w:t>
+      </w:r>
+    </w:p>
+    <w:p>
+      <w:r>
+        <w:t>На практике были запрограммированы</w:t>
+      </w:r>
+      <w:r>
+        <w:t xml:space="preserve"> интеллектуальны</w:t>
+      </w:r>
+      <w:r>
+        <w:t xml:space="preserve">е </w:t>
+      </w:r>
+      <w:r>
+        <w:t>агент</w:t>
+      </w:r>
+      <w:r>
+        <w:t>ы</w:t>
+      </w:r>
+      <w:r>
+        <w:t>, функционирующи</w:t>
+      </w:r>
+      <w:r>
+        <w:t>е</w:t>
+      </w:r>
+      <w:r>
+        <w:t xml:space="preserve"> в </w:t>
+      </w:r>
+      <w:r>
+        <w:t xml:space="preserve">различных </w:t>
+      </w:r>
+      <w:r>
+        <w:t>недетерминированных средах</w:t>
+      </w:r>
+      <w:r>
+        <w:t xml:space="preserve"> и реализующие </w:t>
+      </w:r>
+      <w:proofErr w:type="spellStart"/>
+      <w:r>
+        <w:t>разлиные</w:t>
+      </w:r>
+      <w:proofErr w:type="spellEnd"/>
+      <w:r>
+        <w:t xml:space="preserve"> методы поиска оптимальных политик. В конце работы на основе </w:t>
+      </w:r>
+      <w:r>
+        <w:rPr>
+          <w:lang w:val="en-US"/>
+        </w:rPr>
+        <w:t>Q</w:t>
+      </w:r>
+      <w:r>
+        <w:t>-</w:t>
+      </w:r>
+      <w:r>
+        <w:t>обучения была создана нейронная сеть, обучающаяся с подкреплением.</w:t>
+      </w:r>
+    </w:p>
+    <w:p>
       <w:pPr>
         <w:rPr>
           <w:szCs w:val="28"/>
         </w:rPr>
       </w:pPr>
-      <w:r>
-        <w:t>.</w:t>
-      </w:r>
     </w:p>
     <w:p/>
     <w:sectPr>
-      <w:headerReference w:type="default" r:id="rId16"/>
-      <w:headerReference w:type="first" r:id="rId17"/>
+      <w:headerReference w:type="default" r:id="rId17"/>
+      <w:headerReference w:type="first" r:id="rId18"/>
       <w:pgSz w:w="11906" w:h="16838"/>
       <w:pgMar w:top="851" w:right="567" w:bottom="851" w:left="1418" w:header="680" w:footer="680" w:gutter="0"/>
       <w:cols w:space="708"/>

</xml_diff>

<commit_message>
finally at least smthg
</commit_message>
<xml_diff>
--- a/8 семестр/МиСИИ/ЛР 7/МиСИИ ЛР 7.docx
+++ b/8 семестр/МиСИИ/ЛР 7/МиСИИ ЛР 7.docx
@@ -944,10 +944,7 @@
         <w:t>a</w:t>
       </w:r>
       <w:r>
-        <w:t>)</w:t>
-      </w:r>
-      <w:r>
-        <w:t>.</w:t>
+        <w:t>).</w:t>
       </w:r>
     </w:p>
     <w:p/>
@@ -4945,7 +4942,6 @@
         <w:rPr>
           <w:i/>
           <w:iCs/>
-          <w:lang w:val="en-US"/>
         </w:rPr>
       </w:pPr>
       <w:r>
@@ -5507,6 +5503,7 @@
         <w:t xml:space="preserve">        </w:t>
       </w:r>
       <w:proofErr w:type="spellStart"/>
+      <w:proofErr w:type="gramStart"/>
       <w:r>
         <w:rPr>
           <w:lang w:val="en-US"/>
@@ -5518,7 +5515,14 @@
         <w:rPr>
           <w:lang w:val="en-US"/>
         </w:rPr>
-        <w:t>.__</w:t>
+        <w:t>._</w:t>
+      </w:r>
+      <w:proofErr w:type="gramEnd"/>
+      <w:r>
+        <w:rPr>
+          <w:lang w:val="en-US"/>
+        </w:rPr>
+        <w:t>_</w:t>
       </w:r>
       <w:proofErr w:type="spellStart"/>
       <w:r>
@@ -8079,11 +8083,6 @@
     </w:p>
     <w:p/>
     <w:p>
-      <w:pPr>
-        <w:rPr>
-          <w:lang w:val="en-US"/>
-        </w:rPr>
-      </w:pPr>
       <w:r>
         <w:t xml:space="preserve">Листинг 3.5 – Подкласс агента </w:t>
       </w:r>
@@ -9100,14 +9099,15 @@
     <w:p>
       <w:pPr>
         <w:pStyle w:val="af"/>
-      </w:pPr>
-      <w:proofErr w:type="spellStart"/>
-      <w:r>
-        <w:t>class</w:t>
-      </w:r>
-      <w:proofErr w:type="spellEnd"/>
-      <w:r>
-        <w:t xml:space="preserve"> </w:t>
+        <w:rPr>
+          <w:lang w:val="en-US"/>
+        </w:rPr>
+      </w:pPr>
+      <w:r>
+        <w:rPr>
+          <w:lang w:val="en-US"/>
+        </w:rPr>
+        <w:t xml:space="preserve">class </w:t>
       </w:r>
       <w:proofErr w:type="spellStart"/>
       <w:proofErr w:type="gramStart"/>
@@ -9115,20 +9115,30 @@
         <w:rPr>
           <w:b/>
           <w:bCs/>
+          <w:lang w:val="en-US"/>
         </w:rPr>
         <w:t>ApproximateQAgent</w:t>
       </w:r>
       <w:proofErr w:type="spellEnd"/>
       <w:r>
+        <w:rPr>
+          <w:lang w:val="en-US"/>
+        </w:rPr>
         <w:t>(</w:t>
       </w:r>
       <w:proofErr w:type="spellStart"/>
       <w:proofErr w:type="gramEnd"/>
       <w:r>
+        <w:rPr>
+          <w:lang w:val="en-US"/>
+        </w:rPr>
         <w:t>PacmanQAgent</w:t>
       </w:r>
       <w:proofErr w:type="spellEnd"/>
       <w:r>
+        <w:rPr>
+          <w:lang w:val="en-US"/>
+        </w:rPr>
         <w:t>):</w:t>
       </w:r>
     </w:p>
@@ -9515,6 +9525,9 @@
     <w:p>
       <w:pPr>
         <w:pStyle w:val="af"/>
+        <w:rPr>
+          <w:lang w:val="en-US"/>
+        </w:rPr>
       </w:pPr>
       <w:r>
         <w:rPr>
@@ -9555,6 +9568,9 @@
         </w:rPr>
       </w:pPr>
       <w:r>
+        <w:rPr>
+          <w:lang w:val="en-US"/>
+        </w:rPr>
         <w:t xml:space="preserve">        </w:t>
       </w:r>
       <w:r>
@@ -9666,80 +9682,123 @@
     <w:p>
       <w:pPr>
         <w:pStyle w:val="af"/>
+        <w:rPr>
+          <w:lang w:val="en-US"/>
+        </w:rPr>
       </w:pPr>
       <w:r>
         <w:t xml:space="preserve">        </w:t>
       </w:r>
-      <w:proofErr w:type="spellStart"/>
-      <w:r>
-        <w:t>for</w:t>
-      </w:r>
-      <w:proofErr w:type="spellEnd"/>
-      <w:r>
-        <w:t xml:space="preserve"> i </w:t>
-      </w:r>
-      <w:proofErr w:type="spellStart"/>
-      <w:r>
-        <w:t>in</w:t>
-      </w:r>
-      <w:proofErr w:type="spellEnd"/>
-      <w:r>
+      <w:r>
+        <w:rPr>
+          <w:lang w:val="en-US"/>
+        </w:rPr>
+        <w:t xml:space="preserve">for </w:t>
+      </w:r>
+      <w:proofErr w:type="spellStart"/>
+      <w:r>
+        <w:rPr>
+          <w:lang w:val="en-US"/>
+        </w:rPr>
+        <w:t>i</w:t>
+      </w:r>
+      <w:proofErr w:type="spellEnd"/>
+      <w:r>
+        <w:rPr>
+          <w:lang w:val="en-US"/>
+        </w:rPr>
+        <w:t xml:space="preserve"> in </w:t>
+      </w:r>
+      <w:proofErr w:type="spellStart"/>
+      <w:proofErr w:type="gramStart"/>
+      <w:r>
+        <w:rPr>
+          <w:lang w:val="en-US"/>
+        </w:rPr>
+        <w:t>self.features</w:t>
+      </w:r>
+      <w:proofErr w:type="spellEnd"/>
+      <w:proofErr w:type="gramEnd"/>
+      <w:r>
+        <w:rPr>
+          <w:lang w:val="en-US"/>
+        </w:rPr>
+        <w:t>:</w:t>
+      </w:r>
+    </w:p>
+    <w:p>
+      <w:pPr>
+        <w:pStyle w:val="af"/>
+        <w:rPr>
+          <w:lang w:val="en-US"/>
+        </w:rPr>
+      </w:pPr>
+      <w:r>
+        <w:rPr>
+          <w:lang w:val="en-US"/>
+        </w:rPr>
+        <w:t xml:space="preserve">            # </w:t>
+      </w:r>
+      <w:r>
+        <w:t>суммируем</w:t>
+      </w:r>
+      <w:r>
+        <w:rPr>
+          <w:lang w:val="en-US"/>
+        </w:rPr>
         <w:t xml:space="preserve"> </w:t>
       </w:r>
-      <w:proofErr w:type="spellStart"/>
-      <w:proofErr w:type="gramStart"/>
-      <w:r>
+      <w:proofErr w:type="gramStart"/>
+      <w:r>
+        <w:t>взвешенные</w:t>
+      </w:r>
+      <w:r>
+        <w:rPr>
+          <w:lang w:val="en-US"/>
+        </w:rPr>
+        <w:t xml:space="preserve">  </w:t>
+      </w:r>
+      <w:r>
+        <w:t>признаки</w:t>
+      </w:r>
+      <w:proofErr w:type="gramEnd"/>
+      <w:r>
+        <w:rPr>
+          <w:lang w:val="en-US"/>
+        </w:rPr>
+        <w:t xml:space="preserve"> </w:t>
+      </w:r>
+    </w:p>
+    <w:p>
+      <w:pPr>
+        <w:pStyle w:val="af"/>
+        <w:rPr>
+          <w:lang w:val="en-US"/>
+        </w:rPr>
+      </w:pPr>
+      <w:r>
+        <w:rPr>
+          <w:lang w:val="en-US"/>
+        </w:rPr>
+        <w:t xml:space="preserve">            </w:t>
+      </w:r>
+      <w:r>
+        <w:rPr>
+          <w:lang w:val="en-US"/>
+        </w:rPr>
+        <w:t xml:space="preserve">total += </w:t>
+      </w:r>
+      <w:proofErr w:type="spellStart"/>
+      <w:proofErr w:type="gramStart"/>
+      <w:r>
+        <w:rPr>
+          <w:lang w:val="en-US"/>
+        </w:rPr>
         <w:t>self.features</w:t>
       </w:r>
       <w:proofErr w:type="spellEnd"/>
       <w:proofErr w:type="gramEnd"/>
       <w:r>
-        <w:t>:</w:t>
-      </w:r>
-    </w:p>
-    <w:p>
-      <w:pPr>
-        <w:pStyle w:val="af"/>
-      </w:pPr>
-      <w:r>
-        <w:t xml:space="preserve">            # суммируем </w:t>
-      </w:r>
-      <w:proofErr w:type="gramStart"/>
-      <w:r>
-        <w:t>взвешенные  признаки</w:t>
-      </w:r>
-      <w:proofErr w:type="gramEnd"/>
-      <w:r>
-        <w:t xml:space="preserve"> </w:t>
-      </w:r>
-    </w:p>
-    <w:p>
-      <w:pPr>
-        <w:pStyle w:val="af"/>
-        <w:rPr>
-          <w:lang w:val="en-US"/>
-        </w:rPr>
-      </w:pPr>
-      <w:r>
-        <w:t xml:space="preserve">            </w:t>
-      </w:r>
-      <w:r>
-        <w:rPr>
-          <w:lang w:val="en-US"/>
-        </w:rPr>
-        <w:t xml:space="preserve">total += </w:t>
-      </w:r>
-      <w:proofErr w:type="spellStart"/>
-      <w:proofErr w:type="gramStart"/>
-      <w:r>
-        <w:rPr>
-          <w:lang w:val="en-US"/>
-        </w:rPr>
-        <w:t>self.features</w:t>
-      </w:r>
-      <w:proofErr w:type="spellEnd"/>
-      <w:proofErr w:type="gramEnd"/>
-      <w:r>
         <w:rPr>
           <w:lang w:val="en-US"/>
         </w:rPr>
@@ -9859,6 +9918,9 @@
     <w:p>
       <w:pPr>
         <w:pStyle w:val="af"/>
+        <w:rPr>
+          <w:lang w:val="en-US"/>
+        </w:rPr>
       </w:pPr>
       <w:r>
         <w:rPr>
@@ -10475,36 +10537,49 @@
     <w:p>
       <w:pPr>
         <w:pStyle w:val="af"/>
+        <w:rPr>
+          <w:lang w:val="en-US"/>
+        </w:rPr>
       </w:pPr>
       <w:r>
         <w:t xml:space="preserve">        </w:t>
       </w:r>
-      <w:proofErr w:type="spellStart"/>
-      <w:r>
-        <w:t>if</w:t>
-      </w:r>
-      <w:proofErr w:type="spellEnd"/>
-      <w:r>
-        <w:t xml:space="preserve"> </w:t>
-      </w:r>
-      <w:proofErr w:type="spellStart"/>
-      <w:proofErr w:type="gramStart"/>
-      <w:r>
+      <w:r>
+        <w:rPr>
+          <w:lang w:val="en-US"/>
+        </w:rPr>
+        <w:t xml:space="preserve">if </w:t>
+      </w:r>
+      <w:proofErr w:type="spellStart"/>
+      <w:proofErr w:type="gramStart"/>
+      <w:r>
+        <w:rPr>
+          <w:lang w:val="en-US"/>
+        </w:rPr>
         <w:t>self.episodesSoFar</w:t>
       </w:r>
       <w:proofErr w:type="spellEnd"/>
       <w:proofErr w:type="gramEnd"/>
       <w:r>
+        <w:rPr>
+          <w:lang w:val="en-US"/>
+        </w:rPr>
         <w:t xml:space="preserve"> == </w:t>
       </w:r>
       <w:proofErr w:type="spellStart"/>
       <w:proofErr w:type="gramStart"/>
       <w:r>
+        <w:rPr>
+          <w:lang w:val="en-US"/>
+        </w:rPr>
         <w:t>self.numTraining</w:t>
       </w:r>
       <w:proofErr w:type="spellEnd"/>
       <w:proofErr w:type="gramEnd"/>
       <w:r>
+        <w:rPr>
+          <w:lang w:val="en-US"/>
+        </w:rPr>
         <w:t>:</w:t>
       </w:r>
     </w:p>
@@ -10513,7 +10588,13 @@
         <w:pStyle w:val="af"/>
       </w:pPr>
       <w:r>
-        <w:t xml:space="preserve">            # здесь, если захотите, вы можете распечатать веса при отладке</w:t>
+        <w:rPr>
+          <w:lang w:val="en-US"/>
+        </w:rPr>
+        <w:t xml:space="preserve">            </w:t>
+      </w:r>
+      <w:r>
+        <w:t># здесь, если захотите, вы можете распечатать веса при отладке</w:t>
       </w:r>
     </w:p>
     <w:p>
@@ -11041,7 +11122,6 @@
         </w:rPr>
         <w:t xml:space="preserve">, </w:t>
       </w:r>
-      <w:proofErr w:type="spellStart"/>
       <w:proofErr w:type="gramStart"/>
       <w:r>
         <w:rPr>
@@ -11049,27 +11129,12 @@
         </w:rPr>
         <w:t>self.weights</w:t>
       </w:r>
-      <w:proofErr w:type="spellEnd"/>
-      <w:proofErr w:type="gramEnd"/>
-      <w:r>
-        <w:rPr>
-          <w:lang w:val="en-US"/>
-        </w:rPr>
-        <w:t>[</w:t>
-      </w:r>
-      <w:proofErr w:type="spellStart"/>
-      <w:r>
-        <w:rPr>
-          <w:lang w:val="en-US"/>
-        </w:rPr>
-        <w:t>i</w:t>
-      </w:r>
-      <w:proofErr w:type="spellEnd"/>
-      <w:r>
-        <w:rPr>
-          <w:lang w:val="en-US"/>
-        </w:rPr>
-        <w:t>]))</w:t>
+      <w:proofErr w:type="gramEnd"/>
+      <w:r>
+        <w:rPr>
+          <w:lang w:val="en-US"/>
+        </w:rPr>
+        <w:t>[i]))</w:t>
       </w:r>
     </w:p>
     <w:p>
@@ -11168,9 +11233,6 @@
       <w:pPr>
         <w:ind w:firstLine="0"/>
         <w:jc w:val="center"/>
-        <w:rPr>
-          <w:lang w:val="en-US"/>
-        </w:rPr>
       </w:pPr>
       <w:r>
         <w:t xml:space="preserve">Рисунок 3.6.1 – Проверка с </w:t>
@@ -11184,13 +11246,7 @@
       </w:r>
       <w:proofErr w:type="spellEnd"/>
     </w:p>
-    <w:p>
-      <w:pPr>
-        <w:rPr>
-          <w:lang w:val="en-US"/>
-        </w:rPr>
-      </w:pPr>
-    </w:p>
+    <w:p/>
     <w:p>
       <w:r>
         <w:t>Правильность реализации агента с аппроксимацией была проверена с помощью автооценивателя (рисунок 3.6.2).</w:t>
@@ -11288,19 +11344,8 @@
     </w:p>
     <w:p/>
     <w:p>
-      <w:pPr>
-        <w:rPr>
-          <w:lang w:val="en-US"/>
-        </w:rPr>
-      </w:pPr>
-      <w:r>
-        <w:t>В</w:t>
-      </w:r>
-      <w:r>
-        <w:t xml:space="preserve"> файле model.py </w:t>
-      </w:r>
-      <w:r>
-        <w:t xml:space="preserve">был </w:t>
+      <w:r>
+        <w:t xml:space="preserve">В файле model.py был </w:t>
       </w:r>
       <w:r>
         <w:t>дописан</w:t>
@@ -11915,15 +11960,15 @@
     <w:p>
       <w:pPr>
         <w:pStyle w:val="af"/>
-        <w:rPr>
-          <w:lang w:val="en-US"/>
-        </w:rPr>
-      </w:pPr>
-      <w:r>
-        <w:rPr>
-          <w:lang w:val="en-US"/>
-        </w:rPr>
-        <w:t xml:space="preserve">        # </w:t>
+      </w:pPr>
+      <w:r>
+        <w:rPr>
+          <w:lang w:val="en-US"/>
+        </w:rPr>
+        <w:t xml:space="preserve">        </w:t>
+      </w:r>
+      <w:r>
+        <w:t xml:space="preserve"># </w:t>
       </w:r>
       <w:proofErr w:type="spellStart"/>
       <w:r>
@@ -11931,40 +11976,41 @@
       </w:r>
       <w:proofErr w:type="spellEnd"/>
       <w:r>
-        <w:rPr>
-          <w:lang w:val="en-US"/>
-        </w:rPr>
         <w:t xml:space="preserve"> </w:t>
       </w:r>
       <w:r>
         <w:t>определить</w:t>
       </w:r>
       <w:r>
-        <w:rPr>
-          <w:lang w:val="en-US"/>
-        </w:rPr>
         <w:t xml:space="preserve"> </w:t>
       </w:r>
-      <w:proofErr w:type="spellStart"/>
-      <w:proofErr w:type="gramStart"/>
-      <w:r>
-        <w:rPr>
-          <w:lang w:val="en-US"/>
-        </w:rPr>
-        <w:t>self.learning</w:t>
-      </w:r>
-      <w:proofErr w:type="gramEnd"/>
-      <w:r>
-        <w:rPr>
-          <w:lang w:val="en-US"/>
-        </w:rPr>
-        <w:t>_rate</w:t>
-      </w:r>
-      <w:proofErr w:type="spellEnd"/>
-      <w:r>
-        <w:rPr>
-          <w:lang w:val="en-US"/>
-        </w:rPr>
+      <w:proofErr w:type="gramStart"/>
+      <w:r>
+        <w:rPr>
+          <w:lang w:val="en-US"/>
+        </w:rPr>
+        <w:t>self</w:t>
+      </w:r>
+      <w:r>
+        <w:t>.</w:t>
+      </w:r>
+      <w:r>
+        <w:rPr>
+          <w:lang w:val="en-US"/>
+        </w:rPr>
+        <w:t>learning</w:t>
+      </w:r>
+      <w:proofErr w:type="gramEnd"/>
+      <w:r>
+        <w:t>_</w:t>
+      </w:r>
+      <w:r>
+        <w:rPr>
+          <w:lang w:val="en-US"/>
+        </w:rPr>
+        <w:t>rate</w:t>
+      </w:r>
+      <w:r>
         <w:t>,</w:t>
       </w:r>
     </w:p>
@@ -11979,7 +12025,43 @@
         <w:rPr>
           <w:lang w:val="en-US"/>
         </w:rPr>
-        <w:t xml:space="preserve">        # </w:t>
+        <w:t> </w:t>
+      </w:r>
+      <w:r>
+        <w:t xml:space="preserve"> </w:t>
+      </w:r>
+      <w:r>
+        <w:rPr>
+          <w:lang w:val="en-US"/>
+        </w:rPr>
+        <w:t> </w:t>
+      </w:r>
+      <w:r>
+        <w:t xml:space="preserve"> </w:t>
+      </w:r>
+      <w:r>
+        <w:rPr>
+          <w:lang w:val="en-US"/>
+        </w:rPr>
+        <w:t> </w:t>
+      </w:r>
+      <w:r>
+        <w:t xml:space="preserve"> </w:t>
+      </w:r>
+      <w:r>
+        <w:rPr>
+          <w:lang w:val="en-US"/>
+        </w:rPr>
+        <w:t> </w:t>
+      </w:r>
+      <w:r>
+        <w:t xml:space="preserve"> </w:t>
+      </w:r>
+      <w:r>
+        <w:rPr>
+          <w:lang w:val="en-US"/>
+        </w:rPr>
+        <w:t xml:space="preserve"># </w:t>
       </w:r>
       <w:proofErr w:type="spellStart"/>
       <w:proofErr w:type="gramStart"/>
@@ -12006,6 +12088,7 @@
         </w:rPr>
         <w:t xml:space="preserve"> </w:t>
       </w:r>
+      <w:proofErr w:type="spellStart"/>
       <w:proofErr w:type="gramStart"/>
       <w:r>
         <w:rPr>
@@ -12018,7 +12101,14 @@
         <w:rPr>
           <w:lang w:val="en-US"/>
         </w:rPr>
-        <w:t>_size!</w:t>
+        <w:t>_size</w:t>
+      </w:r>
+      <w:proofErr w:type="spellEnd"/>
+      <w:r>
+        <w:rPr>
+          <w:lang w:val="en-US"/>
+        </w:rPr>
+        <w:t>!</w:t>
       </w:r>
     </w:p>
     <w:p>
@@ -18099,6 +18189,7 @@
   <w:style w:type="character" w:default="1" w:styleId="a0">
     <w:name w:val="Default Paragraph Font"/>
     <w:uiPriority w:val="1"/>
+    <w:semiHidden/>
     <w:unhideWhenUsed/>
   </w:style>
   <w:style w:type="table" w:default="1" w:styleId="a1">

</xml_diff>